<commit_message>
Switch Nurfarrah Word version to Merlimau Land recipient
Co-Authored-By: Claude Fable 5 <noreply@anthropic.com>
Claude-Session: https://claude.ai/code/session_0113LWKoTzjGtBtD8ARFunRK
</commit_message>
<xml_diff>
--- a/NOTIS_1_NURFARRAH.docx
+++ b/NOTIS_1_NURFARRAH.docx
@@ -128,7 +128,7 @@
           <w:sz w:val="24"/>
           <w:szCs w:val="24"/>
         </w:rPr>
-        <w:t xml:space="preserve">PARKLAND GROUP</w:t>
+        <w:t xml:space="preserve">MERLIMAU LAND SDN. BHD. (201401015597 / 1091684-M)</w:t>
       </w:r>
     </w:p>
     <w:p>
@@ -138,10 +138,10 @@
       <w:r>
         <w:rPr>
           <w:rFonts w:ascii="Helvetica" w:cs="Helvetica" w:eastAsia="Helvetica" w:hAnsi="Helvetica"/>
-          <w:sz w:val="20"/>
-          <w:szCs w:val="20"/>
-        </w:rPr>
-        <w:t xml:space="preserve">(bagi pihak MERLIMAU LAND SDN. BHD. (201401015597 / 1091684-M))</w:t>
+          <w:sz w:val="24"/>
+          <w:szCs w:val="24"/>
+        </w:rPr>
+        <w:t xml:space="preserve">(Alamat Berdaftar)</w:t>
       </w:r>
     </w:p>
     <w:p>
@@ -154,7 +154,7 @@
           <w:sz w:val="24"/>
           <w:szCs w:val="24"/>
         </w:rPr>
-        <w:t xml:space="preserve">(Parkland Headquarters Office)</w:t>
+        <w:t xml:space="preserve">No. 48, Jalan Kota Laksamana 2/15,</w:t>
       </w:r>
     </w:p>
     <w:p>
@@ -167,7 +167,7 @@
           <w:sz w:val="24"/>
           <w:szCs w:val="24"/>
         </w:rPr>
-        <w:t xml:space="preserve">No. 112, Jalan Tun Perak,</w:t>
+        <w:t xml:space="preserve">Taman Kota Laksamana, Seksyen 2,</w:t>
       </w:r>
     </w:p>
     <w:p>
@@ -180,7 +180,7 @@
           <w:sz w:val="24"/>
           <w:szCs w:val="24"/>
         </w:rPr>
-        <w:t xml:space="preserve">75300 Melaka.</w:t>
+        <w:t xml:space="preserve">75200 Melaka.</w:t>
       </w:r>
     </w:p>
     <w:p>
@@ -2612,7 +2612,7 @@
           <w:sz w:val="24"/>
           <w:szCs w:val="24"/>
         </w:rPr>
-        <w:t xml:space="preserve">Dengan ini diakui bahawa PARKLAND GROUP, bagi pihak MERLIMAU LAND SDN. BHD. (201401015597 / 1091684-M), telah menerima Notis Pertama — Tuntutan Pembetulan Kecacatan (Defect Rectification Claim) bertarikh 7 September 2026 dengan rujukan NOTIS-1/2026/039 daripada NURFARRAH AMIERA MOHD AZLAN berhubung hartanah di JD 6317, Jalan Desa Sungai Rambai 1, Taman Desa Sungai Rambai, 77400 Sungai Rambai, Melaka.</w:t>
+        <w:t xml:space="preserve">Dengan ini diakui bahawa MERLIMAU LAND SDN. BHD. (201401015597 / 1091684-M) telah menerima Notis Pertama — Tuntutan Pembetulan Kecacatan (Defect Rectification Claim) bertarikh 7 September 2026 dengan rujukan NOTIS-1/2026/039 daripada NURFARRAH AMIERA MOHD AZLAN berhubung hartanah di JD 6317, Jalan Desa Sungai Rambai 1, Taman Desa Sungai Rambai, 77400 Sungai Rambai, Melaka.</w:t>
       </w:r>
     </w:p>
     <w:p>
@@ -2746,7 +2746,7 @@
           <w:sz w:val="24"/>
           <w:szCs w:val="24"/>
         </w:rPr>
-        <w:t xml:space="preserve">Dengan ini diakui bahawa PARKLAND GROUP, bagi pihak MERLIMAU LAND SDN. BHD. (201401015597 / 1091684-M), telah menerima Notis Pertama — Tuntutan Pembetulan Kecacatan (Defect Rectification Claim) bertarikh 7 September 2026 dengan rujukan NOTIS-1/2026/039 daripada NURFARRAH AMIERA MOHD AZLAN berhubung hartanah di JD 6317, Jalan Desa Sungai Rambai 1, Taman Desa Sungai Rambai, 77400 Sungai Rambai, Melaka.</w:t>
+        <w:t xml:space="preserve">Dengan ini diakui bahawa MERLIMAU LAND SDN. BHD. (201401015597 / 1091684-M) telah menerima Notis Pertama — Tuntutan Pembetulan Kecacatan (Defect Rectification Claim) bertarikh 7 September 2026 dengan rujukan NOTIS-1/2026/039 daripada NURFARRAH AMIERA MOHD AZLAN berhubung hartanah di JD 6317, Jalan Desa Sungai Rambai 1, Taman Desa Sungai Rambai, 77400 Sungai Rambai, Melaka.</w:t>
       </w:r>
     </w:p>
     <w:p>

</xml_diff>